<commit_message>
Clarify textbook-based agent analysis workflow
</commit_message>
<xml_diff>
--- a/final_submission/财报智析Agent_作业题目说明.docx
+++ b/final_submission/财报智析Agent_作业题目说明.docx
@@ -268,7 +268,7 @@
     </w:p>
     <w:p>
       <w:r>
-        <w:t>本项目切入的不是一般聊天机器人问题，而是会计、财务和审计场景中的财务报告解读问题。从深交所互动易、上证 e 互动、全景路演等投资者互动平台可以看到，投资者经常围绕年报中的经营现金流、应收账款、坏账准备、收入确认和资产负债率等指标向上市公司追问，说明年报数字到财务判断之间仍存在明显的信息处理成本。上市公司年度报告篇幅长、表格结构复杂，普通用户往往难以快速把 PDF/Word 年报转换为可分析的标准财务数据。本项目研究如何构建一个会计垂直领域 Agent，使其能够读取年报或标准 Excel/CSV，生成标准化数据，并进一步完成指标计算、趋势分析、杜邦分析、现金流量质量分析、风险识别和标准化报告生成。项目已完成 GitHub 仓库发布和 Streamlit Cloud 在线部署，形成可在线访问、可课堂演示、可复现实验的初步应用形态。</w:t>
+        <w:t>本项目切入的不是一般聊天机器人问题，而是会计、财务和审计场景中的财务报告解读问题。从深交所互动易、上证 e 互动、全景路演等投资者互动平台可以看到，投资者经常围绕年报中的经营现金流、应收账款、坏账准备、收入确认和资产负债率等指标向上市公司追问，说明年报数字到财务判断之间仍存在明显的信息处理成本。上市公司年度报告篇幅长、表格结构复杂，普通用户往往难以快速把 PDF/Word 年报转换为可分析的标准财务数据。本项目研究如何构建一个会计垂直领域 Agent，使其能够读取年报或标准 Excel/CSV，生成标准化数据，并进一步完成指标计算、趋势分析、杜邦分析、现金流量质量分析、风险识别和标准化报告生成。其中，初步 Agent 分析流程不是主观拼接，而是以张新民、钱爱民《财务报表分析（第6版·立体化数字教材版）案例分析与学习指导》中的偿债能力、营运能力、盈利能力、成长能力、现金流量质量分析和杜邦分析等经典财务报表分析框架为依据，再将其转化为可调用的工具链。项目已完成 GitHub 仓库发布和 Streamlit Cloud 在线部署，形成可在线访问、可课堂演示、可复现实验的初步应用形态。</w:t>
       </w:r>
     </w:p>
     <w:p>
@@ -297,6 +297,14 @@
         <w:ind w:left="259"/>
       </w:pPr>
       <w:r>
+        <w:t>分析框架来源：张新民、钱爱民《财务报表分析（第6版·立体化数字教材版）案例分析与学习指导》，用于确定 Agent 的指标分类、分析顺序和报告结构。</w:t>
+      </w:r>
+    </w:p>
+    <w:p>
+      <w:pPr>
+        <w:ind w:left="259"/>
+      </w:pPr>
+      <w:r>
         <w:t>真实年报读取样例：accounting-agent/data/科大讯飞_2025年年度报告.pdf。系统已扫描 301 / 301 页，抽取 15 个标准财务科目，核心科目覆盖率 100%。</w:t>
       </w:r>
     </w:p>
@@ -322,6 +330,14 @@
       </w:pPr>
       <w:r>
         <w:t>3. 研究方法</w:t>
+      </w:r>
+    </w:p>
+    <w:p>
+      <w:pPr>
+        <w:ind w:left="259"/>
+      </w:pPr>
+      <w:r>
+        <w:t>以张新民、钱爱民《财务报表分析（第6版·立体化数字教材版）案例分析与学习指导》为权威教材依据，将偿债能力、营运能力、盈利能力、成长能力、现金流量质量和杜邦分析整理为 Agent 工作流。</w:t>
       </w:r>
     </w:p>
     <w:p>
@@ -451,7 +467,7 @@
           </w:tcPr>
           <w:p>
             <w:r>
-              <w:t>负责财务报表分析教材框架、指标体系、风险规则和相关文献资料的收集整理，参与报告结构设计、页面表达优化和前端视觉美化，协助校对指标名称、报告表述和课堂展示材料。</w:t>
+              <w:t>负责张新民、钱爱民《财务报表分析（第6版·立体化数字教材版）案例分析与学习指导》等权威教材框架、指标体系、风险规则和相关文献资料的收集整理，参与报告结构设计、页面表达优化和前端视觉美化，协助校对指标名称、报告表述和课堂展示材料。</w:t>
             </w:r>
           </w:p>
         </w:tc>

</xml_diff>

<commit_message>
Align final submission with updated course guide
</commit_message>
<xml_diff>
--- a/final_submission/财报智析Agent_作业题目说明.docx
+++ b/final_submission/财报智析Agent_作业题目说明.docx
@@ -24,7 +24,7 @@
           <w:color w:val="5A5A5A"/>
           <w:sz w:val="24"/>
         </w:rPr>
-        <w:t>财报智析 Agent：基于年报读取与确定性指标计算的会计垂直智能体</w:t>
+        <w:t>财报智析 Agent：基于教材框架自动化的智能体会计场景应用案例</w:t>
       </w:r>
     </w:p>
     <w:tbl>
@@ -98,7 +98,7 @@
           </w:tcPr>
           <w:p>
             <w:r>
-              <w:t>选题二：会计垂直领域智能体（Agent）</w:t>
+              <w:t>选题二：智能体会计场景应用案例</w:t>
             </w:r>
           </w:p>
         </w:tc>
@@ -110,17 +110,17 @@
           </w:tcPr>
           <w:p>
             <w:r>
-              <w:t>项目名称</w:t>
-            </w:r>
-          </w:p>
-        </w:tc>
-        <w:tc>
-          <w:tcPr>
-            <w:tcW w:type="dxa" w:w="4680"/>
-          </w:tcPr>
-          <w:p>
-            <w:r>
-              <w:t>财报智析 Agent</w:t>
+              <w:t>选题定位</w:t>
+            </w:r>
+          </w:p>
+        </w:tc>
+        <w:tc>
+          <w:tcPr>
+            <w:tcW w:type="dxa" w:w="4680"/>
+          </w:tcPr>
+          <w:p>
+            <w:r>
+              <w:t>对应新版课程指南中“将主流财务报表分析教材的分析框架自动化、智能化，输入年度财务报告及必要结构化数据，自动输出标准化分析报告”的选题二示例路径。</w:t>
             </w:r>
           </w:p>
         </w:tc>
@@ -132,17 +132,17 @@
           </w:tcPr>
           <w:p>
             <w:r>
-              <w:t>小组成员</w:t>
-            </w:r>
-          </w:p>
-        </w:tc>
-        <w:tc>
-          <w:tcPr>
-            <w:tcW w:type="dxa" w:w="4680"/>
-          </w:tcPr>
-          <w:p>
-            <w:r>
-              <w:t>徐北辰 202408240218 24级智能会计班；周亦轩 202408240302 24级智能会计班</w:t>
+              <w:t>项目名称</w:t>
+            </w:r>
+          </w:p>
+        </w:tc>
+        <w:tc>
+          <w:tcPr>
+            <w:tcW w:type="dxa" w:w="4680"/>
+          </w:tcPr>
+          <w:p>
+            <w:r>
+              <w:t>财报智析 Agent</w:t>
             </w:r>
           </w:p>
         </w:tc>
@@ -154,17 +154,17 @@
           </w:tcPr>
           <w:p>
             <w:r>
-              <w:t>组长</w:t>
-            </w:r>
-          </w:p>
-        </w:tc>
-        <w:tc>
-          <w:tcPr>
-            <w:tcW w:type="dxa" w:w="4680"/>
-          </w:tcPr>
-          <w:p>
-            <w:r>
-              <w:t>徐北辰 202408240218 24级智能会计班</w:t>
+              <w:t>小组成员</w:t>
+            </w:r>
+          </w:p>
+        </w:tc>
+        <w:tc>
+          <w:tcPr>
+            <w:tcW w:type="dxa" w:w="4680"/>
+          </w:tcPr>
+          <w:p>
+            <w:r>
+              <w:t>徐北辰 202408240218 24级智能会计班；周亦轩 202408240302 24级智能会计班</w:t>
             </w:r>
           </w:p>
         </w:tc>
@@ -176,17 +176,17 @@
           </w:tcPr>
           <w:p>
             <w:r>
-              <w:t>提交日期</w:t>
-            </w:r>
-          </w:p>
-        </w:tc>
-        <w:tc>
-          <w:tcPr>
-            <w:tcW w:type="dxa" w:w="4680"/>
-          </w:tcPr>
-          <w:p>
-            <w:r>
-              <w:t>2026年6月12日</w:t>
+              <w:t>组长</w:t>
+            </w:r>
+          </w:p>
+        </w:tc>
+        <w:tc>
+          <w:tcPr>
+            <w:tcW w:type="dxa" w:w="4680"/>
+          </w:tcPr>
+          <w:p>
+            <w:r>
+              <w:t>徐北辰 202408240218 24级智能会计班</w:t>
             </w:r>
           </w:p>
         </w:tc>
@@ -198,17 +198,17 @@
           </w:tcPr>
           <w:p>
             <w:r>
-              <w:t>运行环境</w:t>
-            </w:r>
-          </w:p>
-        </w:tc>
-        <w:tc>
-          <w:tcPr>
-            <w:tcW w:type="dxa" w:w="4680"/>
-          </w:tcPr>
-          <w:p>
-            <w:r>
-              <w:t>Python 3.11；Streamlit；pandas；smolagents；OpenAI-compatible API；pdfplumber；PyMuPDF；python-docx</w:t>
+              <w:t>提交日期</w:t>
+            </w:r>
+          </w:p>
+        </w:tc>
+        <w:tc>
+          <w:tcPr>
+            <w:tcW w:type="dxa" w:w="4680"/>
+          </w:tcPr>
+          <w:p>
+            <w:r>
+              <w:t>2026年6月12日</w:t>
             </w:r>
           </w:p>
         </w:tc>
@@ -220,17 +220,17 @@
           </w:tcPr>
           <w:p>
             <w:r>
-              <w:t>在线演示地址</w:t>
-            </w:r>
-          </w:p>
-        </w:tc>
-        <w:tc>
-          <w:tcPr>
-            <w:tcW w:type="dxa" w:w="4680"/>
-          </w:tcPr>
-          <w:p>
-            <w:r>
-              <w:t>https://accounting-agent-yspsw2afdlis9itfyheqde.streamlit.app/</w:t>
+              <w:t>运行环境</w:t>
+            </w:r>
+          </w:p>
+        </w:tc>
+        <w:tc>
+          <w:tcPr>
+            <w:tcW w:type="dxa" w:w="4680"/>
+          </w:tcPr>
+          <w:p>
+            <w:r>
+              <w:t>Python 3.11；Streamlit；pandas；smolagents；OpenAI-compatible API；pdfplumber；PyMuPDF；python-docx</w:t>
             </w:r>
           </w:p>
         </w:tc>
@@ -242,6 +242,28 @@
           </w:tcPr>
           <w:p>
             <w:r>
+              <w:t>在线演示地址</w:t>
+            </w:r>
+          </w:p>
+        </w:tc>
+        <w:tc>
+          <w:tcPr>
+            <w:tcW w:type="dxa" w:w="4680"/>
+          </w:tcPr>
+          <w:p>
+            <w:r>
+              <w:t>https://accounting-agent-yspsw2afdlis9itfyheqde.streamlit.app/</w:t>
+            </w:r>
+          </w:p>
+        </w:tc>
+      </w:tr>
+      <w:tr>
+        <w:tc>
+          <w:tcPr>
+            <w:tcW w:type="dxa" w:w="4680"/>
+          </w:tcPr>
+          <w:p>
+            <w:r>
               <w:t>GitHub 仓库</w:t>
             </w:r>
           </w:p>
@@ -268,7 +290,7 @@
     </w:p>
     <w:p>
       <w:r>
-        <w:t>本项目切入的不是一般聊天机器人问题，而是会计、财务和审计场景中的财务报告解读问题。从深交所互动易、上证 e 互动、全景路演等投资者互动平台可以看到，投资者经常围绕年报中的经营现金流、应收账款、坏账准备、收入确认和资产负债率等指标向上市公司追问，说明年报数字到财务判断之间仍存在明显的信息处理成本。上市公司年度报告篇幅长、表格结构复杂，普通用户往往难以快速把 PDF/Word 年报转换为可分析的标准财务数据。本项目研究如何构建一个会计垂直领域 Agent，使其能够读取年报或标准 Excel/CSV，生成标准化数据，并进一步完成指标计算、趋势分析、杜邦分析、现金流量质量分析、风险识别和标准化报告生成。其中，初步 Agent 分析流程不是主观拼接，而是以张新民、钱爱民《财务报表分析（第6版·立体化数字教材版）案例分析与学习指导》中的偿债能力、营运能力、盈利能力、成长能力、现金流量质量分析和杜邦分析等经典财务报表分析框架为依据，再将其转化为可调用的工具链。项目已完成 GitHub 仓库发布和 Streamlit Cloud 在线部署，形成可在线访问、可课堂演示、可复现实验的初步应用形态。</w:t>
+        <w:t>本项目切入的不是一般聊天机器人问题，而是会计、财务和审计场景中的财务报告解读问题。从深交所互动易、上证 e 互动、全景路演等投资者互动平台可以看到，投资者经常围绕年报中的经营现金流、应收账款、坏账准备、收入确认和资产负债率等指标向上市公司追问，说明年报数字到财务判断之间仍存在明显的信息处理成本。上市公司年度报告篇幅长、表格结构复杂，普通用户往往难以快速把 PDF/Word 年报转换为可分析的标准财务数据。本项目研究如何构建一个会计垂直领域 Agent，使其能够读取年报或标准 Excel/CSV，生成标准化数据，并进一步完成指标计算、趋势分析、杜邦分析、现金流量质量分析、风险识别和标准化报告生成。其中，初步 Agent 分析流程不是主观拼接，而是以张新民、钱爱民《财务报表分析（第6版·立体化数字教材版）案例分析与学习指导》中的偿债能力、营运能力、盈利能力、成长能力、现金流量质量分析和杜邦分析等经典财务报表分析框架为依据，再将其转化为可调用的工具链。对应新版课程指南中“将主流财务报表分析教材的分析框架自动化、智能化，输入年度财务报告及必要结构化数据，自动输出标准化分析报告”的选题二示例路径。项目已完成 GitHub 仓库发布和 Streamlit Cloud 在线部署，形成可在线访问、可课堂演示、可复现实验的初步应用形态。</w:t>
       </w:r>
     </w:p>
     <w:p>
@@ -496,7 +518,136 @@
         <w:pStyle w:val="Heading1"/>
       </w:pPr>
       <w:r>
-        <w:t>6. 作业承诺</w:t>
+        <w:t>6. 新版评分维度对应</w:t>
+      </w:r>
+    </w:p>
+    <w:tbl>
+      <w:tblPr>
+        <w:tblW w:type="auto" w:w="0"/>
+        <w:tblLayout w:type="autofit"/>
+        <w:tblLook w:firstColumn="1" w:firstRow="1" w:lastColumn="0" w:lastRow="0" w:noHBand="0" w:noVBand="1" w:val="04A0"/>
+      </w:tblPr>
+      <w:tblGrid>
+        <w:gridCol w:w="4680"/>
+        <w:gridCol w:w="4680"/>
+      </w:tblGrid>
+      <w:tr>
+        <w:tc>
+          <w:tcPr>
+            <w:tcW w:type="dxa" w:w="4680"/>
+          </w:tcPr>
+          <w:p>
+            <w:r>
+              <w:t>项目</w:t>
+            </w:r>
+          </w:p>
+        </w:tc>
+        <w:tc>
+          <w:tcPr>
+            <w:tcW w:type="dxa" w:w="4680"/>
+          </w:tcPr>
+          <w:p>
+            <w:r>
+              <w:t>内容</w:t>
+            </w:r>
+          </w:p>
+        </w:tc>
+      </w:tr>
+      <w:tr>
+        <w:tc>
+          <w:tcPr>
+            <w:tcW w:type="dxa" w:w="4680"/>
+          </w:tcPr>
+          <w:p>
+            <w:r>
+              <w:t>1. 会计专业价值</w:t>
+            </w:r>
+          </w:p>
+        </w:tc>
+        <w:tc>
+          <w:tcPr>
+            <w:tcW w:type="dxa" w:w="4680"/>
+          </w:tcPr>
+          <w:p>
+            <w:r>
+              <w:t>项目从投资者互动平台、年报可读性和信息处理成本文献中识别财报解读痛点，再以张新民、钱爱民《财务报表分析（第6版·立体化数字教材版）案例分析与学习指导》为专业框架，把偿债、营运、盈利、成长、现金流量质量和杜邦分析流程自动化。该设计直接服务财报分析、投资者理解和审慎风险识别，具有明确会计/财务/审计场景价值。</w:t>
+            </w:r>
+          </w:p>
+        </w:tc>
+      </w:tr>
+      <w:tr>
+        <w:tc>
+          <w:tcPr>
+            <w:tcW w:type="dxa" w:w="4680"/>
+          </w:tcPr>
+          <w:p>
+            <w:r>
+              <w:t>2. 技术创新与性能</w:t>
+            </w:r>
+          </w:p>
+        </w:tc>
+        <w:tc>
+          <w:tcPr>
+            <w:tcW w:type="dxa" w:w="4680"/>
+          </w:tcPr>
+          <w:p>
+            <w:r>
+              <w:t>系统采用“确定性 Python 工具 + smolagents/大模型调度与报告表达”的组合，支持 PDF/Word 年报抽取、标准 CSV 生成、动态 Agent trace、API 配置和 fallback pipeline。真实科大讯飞年报验证扫描 301 页，核心科目覆盖率 100%，降低模型直接生成财务数字的幻觉风险。</w:t>
+            </w:r>
+          </w:p>
+        </w:tc>
+      </w:tr>
+      <w:tr>
+        <w:tc>
+          <w:tcPr>
+            <w:tcW w:type="dxa" w:w="4680"/>
+          </w:tcPr>
+          <w:p>
+            <w:r>
+              <w:t>3. 工程规范与文档</w:t>
+            </w:r>
+          </w:p>
+        </w:tc>
+        <w:tc>
+          <w:tcPr>
+            <w:tcW w:type="dxa" w:w="4680"/>
+          </w:tcPr>
+          <w:p>
+            <w:r>
+              <w:t>项目结构包含 app.py、agents/、tools/、schemas/、config/、knowledge/、tests/、notebooks/ 和 final_submission/。README 提供环境配置、运行步骤和输出说明；Jupyter Notebook 作为主代码说明文档，.py 文件作为工程实现；pytest 覆盖关键模块并保留 Word 渲染预览证据。</w:t>
+            </w:r>
+          </w:p>
+        </w:tc>
+      </w:tr>
+      <w:tr>
+        <w:tc>
+          <w:tcPr>
+            <w:tcW w:type="dxa" w:w="4680"/>
+          </w:tcPr>
+          <w:p>
+            <w:r>
+              <w:t>4. 汇报表现与迭代</w:t>
+            </w:r>
+          </w:p>
+        </w:tc>
+        <w:tc>
+          <w:tcPr>
+            <w:tcW w:type="dxa" w:w="4680"/>
+          </w:tcPr>
+          <w:p>
+            <w:r>
+              <w:t>最终材料已吸收新版课程指南要求，补充官方选题表述、教材框架来源、评分维度对应、在线部署说明和海报生成 prompt。项目已发布 GitHub 并部署到 Streamlit Cloud，可用于课堂实时演示、交互测试和展示 Agent 调用过程。</w:t>
+            </w:r>
+          </w:p>
+        </w:tc>
+      </w:tr>
+    </w:tbl>
+    <w:p>
+      <w:pPr>
+        <w:pStyle w:val="Heading1"/>
+      </w:pPr>
+      <w:r>
+        <w:t>7. 作业承诺</w:t>
       </w:r>
     </w:p>
     <w:p>

</xml_diff>